<commit_message>
Update submission documents for top-level English folders
</commit_message>
<xml_diff>
--- a/03-Completed-Submission-Template/Completed-Submission-Template.docx
+++ b/03-Completed-Submission-Template/Completed-Submission-Template.docx
@@ -547,18 +547,7 @@
               <w:spacing w:after="20" w:line="247" w:lineRule="auto"/>
             </w:pPr>
             <w:r>
-              <w:rPr>
-                <w:rFonts w:ascii="Aptos" w:hAnsi="Aptos"/>
-                <w:sz w:val="18"/>
-              </w:rPr>
-              <w:t xml:space="preserve">To be added by the team in </w:t>
-            </w:r>
-            <w:r>
-              <w:rPr>
-                <w:rFonts w:ascii="Aptos" w:hAnsi="Aptos"/>
-                <w:sz w:val="18"/>
-              </w:rPr>
-              <w:t>submission/demo/youtube-demo-link.txt</w:t>
+              <w:t>To be added by the team in 06-YouTube-Product-Demo/youtube-demo-link.txt</w:t>
             </w:r>
           </w:p>
         </w:tc>
@@ -606,18 +595,7 @@
               <w:spacing w:after="20" w:line="247" w:lineRule="auto"/>
             </w:pPr>
             <w:r>
-              <w:rPr>
-                <w:rFonts w:ascii="Aptos" w:hAnsi="Aptos"/>
-                <w:sz w:val="18"/>
-              </w:rPr>
-              <w:t xml:space="preserve">To be uploaded in </w:t>
-            </w:r>
-            <w:r>
-              <w:rPr>
-                <w:rFonts w:ascii="Aptos" w:hAnsi="Aptos"/>
-                <w:sz w:val="18"/>
-              </w:rPr>
-              <w:t>submission/evidence/replit/</w:t>
+              <w:t>To be uploaded in 01-Replit-Utilization-Proof/</w:t>
             </w:r>
           </w:p>
         </w:tc>
@@ -660,7 +638,7 @@
           </w:tcPr>
           <w:p>
             <w:r>
-              <w:t>Team to confirm. No RunPod configuration appears in the current source or Render deployment. If used separately, upload proof to submission/evidence/runpod/ and update the declaration; otherwise mark this item not applicable.</w:t>
+              <w:t>Team to confirm. No RunPod configuration appears in the current source or Render deployment. If used separately, upload proof to 02-RunPod-Utilization-Proof/ and update the declaration; otherwise mark this item not applicable.</w:t>
             </w:r>
           </w:p>
         </w:tc>
@@ -1253,14 +1231,7 @@
         <w:pStyle w:val="ListBullet"/>
       </w:pPr>
       <w:r>
-        <w:t xml:space="preserve">AI and technical tools declaration: </w:t>
-      </w:r>
-      <w:r>
-        <w:rPr>
-          <w:rFonts w:ascii="Consolas" w:hAnsi="Consolas"/>
-          <w:sz w:val="18"/>
-        </w:rPr>
-        <w:t>submission/tech-tools-declaration.docx</w:t>
+        <w:t>AI and technical tools declaration: 04-Completed-Tech-Tools-Declaration/Completed-Tech-Tools-Declaration.docx</w:t>
       </w:r>
     </w:p>
     <w:p>
@@ -1268,14 +1239,7 @@
         <w:pStyle w:val="ListBullet"/>
       </w:pPr>
       <w:r>
-        <w:t xml:space="preserve">Replit evidence folder: </w:t>
-      </w:r>
-      <w:r>
-        <w:rPr>
-          <w:rFonts w:ascii="Consolas" w:hAnsi="Consolas"/>
-          <w:sz w:val="18"/>
-        </w:rPr>
-        <w:t>submission/evidence/replit/</w:t>
+        <w:t>Replit evidence folder: 01-Replit-Utilization-Proof/</w:t>
       </w:r>
     </w:p>
     <w:p>
@@ -1283,14 +1247,7 @@
         <w:pStyle w:val="ListBullet"/>
       </w:pPr>
       <w:r>
-        <w:t xml:space="preserve">Optional RunPod evidence folder: </w:t>
-      </w:r>
-      <w:r>
-        <w:rPr>
-          <w:rFonts w:ascii="Consolas" w:hAnsi="Consolas"/>
-          <w:sz w:val="18"/>
-        </w:rPr>
-        <w:t>submission/evidence/runpod/</w:t>
+        <w:t>Optional RunPod evidence folder: 02-RunPod-Utilization-Proof/</w:t>
       </w:r>
     </w:p>
     <w:p>
@@ -1298,14 +1255,7 @@
         <w:pStyle w:val="ListBullet"/>
       </w:pPr>
       <w:r>
-        <w:t xml:space="preserve">YouTube link file: </w:t>
-      </w:r>
-      <w:r>
-        <w:rPr>
-          <w:rFonts w:ascii="Consolas" w:hAnsi="Consolas"/>
-          <w:sz w:val="18"/>
-        </w:rPr>
-        <w:t>submission/demo/youtube-demo-link.txt</w:t>
+        <w:t>YouTube link file: 06-YouTube-Product-Demo/youtube-demo-link.txt</w:t>
       </w:r>
     </w:p>
     <w:p>

</xml_diff>

<commit_message>
Complete SDC submission form sections
</commit_message>
<xml_diff>
--- a/03-Completed-Submission-Template/Completed-Submission-Template.docx
+++ b/03-Completed-Submission-Template/Completed-Submission-Template.docx
@@ -1271,6 +1271,197 @@
         <w:t>Before submitting, enter the official team name, member names, and contact email; upload Replit proof; add the YouTube demo URL; and confirm whether RunPod was used. If RunPod was not used, leave its evidence item marked not applicable. Do not upload API keys, passwords, real resumes, or private account data as evidence.</w:t>
       </w:r>
     </w:p>
+    <w:p>
+      <w:r>
+        <w:br w:type="page"/>
+      </w:r>
+    </w:p>
+    <w:p>
+      <w:pPr>
+        <w:pStyle w:val="Heading1"/>
+      </w:pPr>
+      <w:r>
+        <w:t>Copy-ready answers for the SDC form</w:t>
+      </w:r>
+    </w:p>
+    <w:p>
+      <w:pPr>
+        <w:pStyle w:val="Heading1"/>
+      </w:pPr>
+      <w:r>
+        <w:t>2. Executive Summary &amp; Problem Statement</w:t>
+      </w:r>
+    </w:p>
+    <w:p>
+      <w:pPr>
+        <w:pStyle w:val="Heading2"/>
+      </w:pPr>
+      <w:r>
+        <w:t>2.1 The Problem Context</w:t>
+      </w:r>
+    </w:p>
+    <w:p>
+      <w:pPr>
+        <w:spacing w:after="160"/>
+      </w:pPr>
+      <w:r>
+        <w:t>AI is changing the tasks and skills required across many occupations, while career guidance, job-market information, and affordable learning options are often spread across different sources. Working adults whose roles are changing, recent graduates, and career switchers can struggle to see how their existing experience transfers to emerging roles or which skills to build next. This can lead to costly or poorly targeted training decisions and make career transitions harder, especially for people with limited access to personalized guidance. Employers, educators, and career services also need clearer ways to discuss changing skill needs without treating uncertain forecasts as guarantees. FutureReady addresses this information and navigation gap. It is a career-exploration aid: it helps people compare skills, roles, evidence, and learning options, while leaving decisions about training and employment to the person and their advisers.</w:t>
+      </w:r>
+    </w:p>
+    <w:p>
+      <w:pPr>
+        <w:pStyle w:val="Heading2"/>
+      </w:pPr>
+      <w:r>
+        <w:t>2.2 The Proposed AI Solution</w:t>
+      </w:r>
+    </w:p>
+    <w:p>
+      <w:pPr>
+        <w:spacing w:after="160"/>
+      </w:pPr>
+      <w:r>
+        <w:t>FutureReady is a bilingual web application that takes a user from a skills profile to explainable future-role suggestions and an ordered reskilling pathway. Users can explore with synthetic profiles in the public demo. In a properly provisioned local deployment, they can provide resume text or a text-based PDF/DOCX, review the extracted text, and confirm the skills used. The local matching workflow uses a pinned, quantized multilingual E5 model in ONNX format to compare profile text with a catalogue of 65 occupations; it reports similarity scores and skill gaps, not hiring probabilities. Dated job-market and research snapshots provide trend context, with visible sources and dates. The app also links roles and skills to SDGs, recommends learning resources, and compares moderate and faster-disruption scenarios. The prototype uses React, TypeScript, Vite, Python, FastAPI, OpenAPI, structured JSON/CSV data, GitHub version control and Actions, Docker, and Render hosting. The matching model is not a generative AI service. The current project does not use an official SDC sponsor-provided GenAI API or cloud platform.</w:t>
+      </w:r>
+    </w:p>
+    <w:p>
+      <w:pPr>
+        <w:pStyle w:val="Heading1"/>
+      </w:pPr>
+      <w:r>
+        <w:t>3. Technical Architecture &amp; Implementation Plan</w:t>
+      </w:r>
+    </w:p>
+    <w:p>
+      <w:pPr>
+        <w:pStyle w:val="Heading2"/>
+      </w:pPr>
+      <w:r>
+        <w:t>3.1 Conceptual Tech Stack</w:t>
+      </w:r>
+    </w:p>
+    <w:p>
+      <w:pPr>
+        <w:pStyle w:val="Heading2"/>
+      </w:pPr>
+      <w:r>
+        <w:t>3.2 Design-Thinking &amp; Deployment Strategy</w:t>
+      </w:r>
+    </w:p>
+    <w:p>
+      <w:pPr>
+        <w:spacing w:after="160"/>
+      </w:pPr>
+      <w:r>
+        <w:t>We shaped the prototype around the user journey in the project brief: describe current skills, understand changing opportunities, compare suitable roles, and choose a practical learning path. The interface explains match evidence, data sources and dates, skill gaps, SDG links, and scenario assumptions so users can question recommendations rather than treat them as decisions. Synthetic profiles support a privacy-conscious public demonstration; the local resume workflow includes text review and user confirmation before matching. Technical feasibility is supported by the working web/API architecture, repository automation, and a hosted synthetic demo. Before deploying resume analysis for real users, Phase 2 should test usability and accessibility with intended users, review privacy and data-retention controls, validate data rights and source freshness, and evaluate recommendation quality and potential bias. No formal user study, fairness assessment, or employment-impact measurement has yet been completed.</w:t>
+      </w:r>
+    </w:p>
+    <w:p>
+      <w:pPr>
+        <w:pStyle w:val="Heading2"/>
+      </w:pPr>
+      <w:r>
+        <w:t>3.1 Stack details and architecture</w:t>
+      </w:r>
+    </w:p>
+    <w:p>
+      <w:pPr>
+        <w:spacing w:after="120"/>
+      </w:pPr>
+      <w:r>
+        <w:rPr>
+          <w:b/>
+        </w:rPr>
+        <w:t xml:space="preserve">Frontend: </w:t>
+      </w:r>
+      <w:r>
+        <w:t>React, TypeScript, and Vite provide the bilingual browser interface and profile review flow.</w:t>
+      </w:r>
+    </w:p>
+    <w:p>
+      <w:pPr>
+        <w:spacing w:after="120"/>
+      </w:pPr>
+      <w:r>
+        <w:rPr>
+          <w:b/>
+        </w:rPr>
+        <w:t xml:space="preserve">API and application logic: </w:t>
+      </w:r>
+      <w:r>
+        <w:t>Python with FastAPI, Uvicorn, and OpenAPI provides the API, intake, role matching, pathway, SDG, and scenario features.</w:t>
+      </w:r>
+    </w:p>
+    <w:p>
+      <w:pPr>
+        <w:spacing w:after="120"/>
+      </w:pPr>
+      <w:r>
+        <w:rPr>
+          <w:b/>
+        </w:rPr>
+        <w:t xml:space="preserve">AI / matching: </w:t>
+      </w:r>
+      <w:r>
+        <w:t>The full local resume-text workflow uses intfloat/multilingual-e5-small in quantized ONNX format for CPU embeddings and cosine-similarity matching. The hosted free demo uses synthetic profiles and does not provide the full resume model workflow.</w:t>
+      </w:r>
+    </w:p>
+    <w:p>
+      <w:pPr>
+        <w:spacing w:after="120"/>
+      </w:pPr>
+      <w:r>
+        <w:rPr>
+          <w:b/>
+        </w:rPr>
+        <w:t xml:space="preserve">Data and storage: </w:t>
+      </w:r>
+      <w:r>
+        <w:t>Versioned JSON/CSV snapshots hold role, skill, trend, source, course, scenario, and SDG mapping data. The current prototype has no SQL database and does not retain uploaded resumes as user history.</w:t>
+      </w:r>
+    </w:p>
+    <w:p>
+      <w:pPr>
+        <w:spacing w:after="120"/>
+      </w:pPr>
+      <w:r>
+        <w:rPr>
+          <w:b/>
+        </w:rPr>
+        <w:t xml:space="preserve">Build and deployment: </w:t>
+      </w:r>
+      <w:r>
+        <w:t>Docker packages the app; GitHub Actions runs repository checks; Render Free hosts the synthetic-profile demonstration.</w:t>
+      </w:r>
+    </w:p>
+    <w:p>
+      <w:pPr>
+        <w:spacing w:after="120"/>
+      </w:pPr>
+      <w:r>
+        <w:rPr>
+          <w:b/>
+        </w:rPr>
+        <w:t xml:space="preserve">System flow: </w:t>
+      </w:r>
+      <w:r>
+        <w:t>User → React/Vite interface (profile entry and review) → FastAPI application → profile and catalogue data (JSON/CSV) → matching and pathway logic → ranked roles, skill gaps, source evidence, learning options, SDG links, and scenarios. In a full local setup, reviewed resume text is embedded by the local E5 ONNX model before role matching.</w:t>
+      </w:r>
+    </w:p>
+    <w:p>
+      <w:pPr>
+        <w:spacing w:after="120"/>
+      </w:pPr>
+      <w:r>
+        <w:rPr>
+          <w:b/>
+        </w:rPr>
+        <w:t xml:space="preserve">SDC sponsor-provided services: </w:t>
+      </w:r>
+      <w:r>
+        <w:t>No official SDC sponsor-provided GenAI API or cloud platform is used in the current prototype. Render is a third-party hosting provider. ChatGPT/Codex assisted development and documentation only; neither is called by the deployed application for runtime matching.</w:t>
+      </w:r>
+    </w:p>
     <w:sectPr>
       <w:footerReference w:type="default" r:id="rId9"/>
       <w:pgSz w:w="12240" w:h="15840"/>

</xml_diff>

<commit_message>
Organize SDC submission answers by form section
</commit_message>
<xml_diff>
--- a/03-Completed-Submission-Template/Completed-Submission-Template.docx
+++ b/03-Completed-Submission-Template/Completed-Submission-Template.docx
@@ -1277,6 +1277,11 @@
       </w:r>
     </w:p>
     <w:p>
+      <w:r>
+        <w:br w:type="page"/>
+      </w:r>
+    </w:p>
+    <w:p>
       <w:pPr>
         <w:pStyle w:val="Heading1"/>
       </w:pPr>
@@ -1301,9 +1306,6 @@
       </w:r>
     </w:p>
     <w:p>
-      <w:pPr>
-        <w:spacing w:after="160"/>
-      </w:pPr>
       <w:r>
         <w:t>AI is changing the tasks and skills required across many occupations, while career guidance, job-market information, and affordable learning options are often spread across different sources. Working adults whose roles are changing, recent graduates, and career switchers can struggle to see how their existing experience transfers to emerging roles or which skills to build next. This can lead to costly or poorly targeted training decisions and make career transitions harder, especially for people with limited access to personalized guidance. Employers, educators, and career services also need clearer ways to discuss changing skill needs without treating uncertain forecasts as guarantees. FutureReady addresses this information and navigation gap. It is a career-exploration aid: it helps people compare skills, roles, evidence, and learning options, while leaving decisions about training and employment to the person and their advisers.</w:t>
       </w:r>
@@ -1317,9 +1319,6 @@
       </w:r>
     </w:p>
     <w:p>
-      <w:pPr>
-        <w:spacing w:after="160"/>
-      </w:pPr>
       <w:r>
         <w:t>FutureReady is a bilingual web application that takes a user from a skills profile to explainable future-role suggestions and an ordered reskilling pathway. Users can explore with synthetic profiles in the public demo. In a properly provisioned local deployment, they can provide resume text or a text-based PDF/DOCX, review the extracted text, and confirm the skills used. The local matching workflow uses a pinned, quantized multilingual E5 model in ONNX format to compare profile text with a catalogue of 65 occupations; it reports similarity scores and skill gaps, not hiring probabilities. Dated job-market and research snapshots provide trend context, with visible sources and dates. The app also links roles and skills to SDGs, recommends learning resources, and compares moderate and faster-disruption scenarios. The prototype uses React, TypeScript, Vite, Python, FastAPI, OpenAPI, structured JSON/CSV data, GitHub version control and Actions, Docker, and Render hosting. The matching model is not a generative AI service. The current project does not use an official SDC sponsor-provided GenAI API or cloud platform.</w:t>
       </w:r>
@@ -1341,33 +1340,6 @@
       </w:r>
     </w:p>
     <w:p>
-      <w:pPr>
-        <w:pStyle w:val="Heading2"/>
-      </w:pPr>
-      <w:r>
-        <w:t>3.2 Design-Thinking &amp; Deployment Strategy</w:t>
-      </w:r>
-    </w:p>
-    <w:p>
-      <w:pPr>
-        <w:spacing w:after="160"/>
-      </w:pPr>
-      <w:r>
-        <w:t>We shaped the prototype around the user journey in the project brief: describe current skills, understand changing opportunities, compare suitable roles, and choose a practical learning path. The interface explains match evidence, data sources and dates, skill gaps, SDG links, and scenario assumptions so users can question recommendations rather than treat them as decisions. Synthetic profiles support a privacy-conscious public demonstration; the local resume workflow includes text review and user confirmation before matching. Technical feasibility is supported by the working web/API architecture, repository automation, and a hosted synthetic demo. Before deploying resume analysis for real users, Phase 2 should test usability and accessibility with intended users, review privacy and data-retention controls, validate data rights and source freshness, and evaluate recommendation quality and potential bias. No formal user study, fairness assessment, or employment-impact measurement has yet been completed.</w:t>
-      </w:r>
-    </w:p>
-    <w:p>
-      <w:pPr>
-        <w:pStyle w:val="Heading2"/>
-      </w:pPr>
-      <w:r>
-        <w:t>3.1 Stack details and architecture</w:t>
-      </w:r>
-    </w:p>
-    <w:p>
-      <w:pPr>
-        <w:spacing w:after="120"/>
-      </w:pPr>
       <w:r>
         <w:rPr>
           <w:b/>
@@ -1379,9 +1351,6 @@
       </w:r>
     </w:p>
     <w:p>
-      <w:pPr>
-        <w:spacing w:after="120"/>
-      </w:pPr>
       <w:r>
         <w:rPr>
           <w:b/>
@@ -1393,9 +1362,6 @@
       </w:r>
     </w:p>
     <w:p>
-      <w:pPr>
-        <w:spacing w:after="120"/>
-      </w:pPr>
       <w:r>
         <w:rPr>
           <w:b/>
@@ -1407,9 +1373,6 @@
       </w:r>
     </w:p>
     <w:p>
-      <w:pPr>
-        <w:spacing w:after="120"/>
-      </w:pPr>
       <w:r>
         <w:rPr>
           <w:b/>
@@ -1421,9 +1384,6 @@
       </w:r>
     </w:p>
     <w:p>
-      <w:pPr>
-        <w:spacing w:after="120"/>
-      </w:pPr>
       <w:r>
         <w:rPr>
           <w:b/>
@@ -1435,23 +1395,43 @@
       </w:r>
     </w:p>
     <w:p>
-      <w:pPr>
-        <w:spacing w:after="120"/>
-      </w:pPr>
       <w:r>
-        <w:rPr>
-          <w:b/>
-        </w:rPr>
-        <w:t xml:space="preserve">System flow: </w:t>
-      </w:r>
-      <w:r>
-        <w:t>User → React/Vite interface (profile entry and review) → FastAPI application → profile and catalogue data (JSON/CSV) → matching and pathway logic → ranked roles, skill gaps, source evidence, learning options, SDG links, and scenarios. In a full local setup, reviewed resume text is embedded by the local E5 ONNX model before role matching.</w:t>
+        <w:t>System flow:</w:t>
       </w:r>
     </w:p>
     <w:p>
       <w:pPr>
-        <w:spacing w:after="120"/>
+        <w:pStyle w:val="NoSpacing"/>
       </w:pPr>
+      <w:r>
+        <w:rPr>
+          <w:rFonts w:ascii="Consolas" w:hAnsi="Consolas"/>
+          <w:sz w:val="18"/>
+        </w:rPr>
+        <w:t>User</w:t>
+        <w:br/>
+        <w:t xml:space="preserve">  ↓</w:t>
+        <w:br/>
+        <w:t>React / TypeScript / Vite (profile entry and review)</w:t>
+        <w:br/>
+        <w:t xml:space="preserve">  ↓</w:t>
+        <w:br/>
+        <w:t>FastAPI application</w:t>
+        <w:br/>
+        <w:t xml:space="preserve">  ↓</w:t>
+        <w:br/>
+        <w:t>Matching and pathway logic ← dated JSON/CSV role, trend, course, source, and SDG data</w:t>
+        <w:br/>
+        <w:t xml:space="preserve">  ↑</w:t>
+        <w:br/>
+        <w:t>Local E5 ONNX embeddings (full local resume workflow only)</w:t>
+        <w:br/>
+        <w:t xml:space="preserve">  ↓</w:t>
+        <w:br/>
+        <w:t>Ranked roles, skill gaps, evidence, learning options, SDG links, and scenarios</w:t>
+      </w:r>
+    </w:p>
+    <w:p>
       <w:r>
         <w:rPr>
           <w:b/>
@@ -1462,13 +1442,19 @@
         <w:t>No official SDC sponsor-provided GenAI API or cloud platform is used in the current prototype. Render is a third-party hosting provider. ChatGPT/Codex assisted development and documentation only; neither is called by the deployed application for runtime matching.</w:t>
       </w:r>
     </w:p>
-    <w:sectPr>
-      <w:footerReference w:type="default" r:id="rId9"/>
-      <w:pgSz w:w="12240" w:h="15840"/>
-      <w:pgMar w:top="979" w:right="1037" w:bottom="979" w:left="1037" w:header="720" w:footer="720" w:gutter="0"/>
-      <w:cols w:space="720"/>
-      <w:docGrid w:linePitch="360"/>
-    </w:sectPr>
+    <w:p>
+      <w:pPr>
+        <w:pStyle w:val="Heading2"/>
+      </w:pPr>
+      <w:r>
+        <w:t>3.2 Design-Thinking &amp; Deployment Strategy</w:t>
+      </w:r>
+    </w:p>
+    <w:p>
+      <w:r>
+        <w:t>We shaped the prototype around the user journey in the project brief: describe current skills, understand changing opportunities, compare suitable roles, and choose a practical learning path. The interface explains match evidence, data sources and dates, skill gaps, SDG links, and scenario assumptions so users can question recommendations rather than treat them as decisions. Synthetic profiles support a privacy-conscious public demonstration; the local resume workflow includes text review and user confirmation before matching. Technical feasibility is supported by the working web/API architecture, repository automation, and a hosted synthetic demo. Before deploying resume analysis for real users, Phase 2 should test usability and accessibility with intended users, review privacy and data-retention controls, validate data rights and source freshness, and evaluate recommendation quality and potential bias. No formal user study, fairness assessment, or employment-impact measurement has yet been completed.</w:t>
+      </w:r>
+    </w:p>
   </w:body>
 </w:document>
 </file>

</xml_diff>

<commit_message>
Complete impact, readiness, and IP declaration sections
</commit_message>
<xml_diff>
--- a/03-Completed-Submission-Template/Completed-Submission-Template.docx
+++ b/03-Completed-Submission-Template/Completed-Submission-Template.docx
@@ -1455,6 +1455,500 @@
         <w:t>We shaped the prototype around the user journey in the project brief: describe current skills, understand changing opportunities, compare suitable roles, and choose a practical learning path. The interface explains match evidence, data sources and dates, skill gaps, SDG links, and scenario assumptions so users can question recommendations rather than treat them as decisions. Synthetic profiles support a privacy-conscious public demonstration; the local resume workflow includes text review and user confirmation before matching. Technical feasibility is supported by the working web/API architecture, repository automation, and a hosted synthetic demo. Before deploying resume analysis for real users, Phase 2 should test usability and accessibility with intended users, review privacy and data-retention controls, validate data rights and source freshness, and evaluate recommendation quality and potential bias. No formal user study, fairness assessment, or employment-impact measurement has yet been completed.</w:t>
       </w:r>
     </w:p>
+    <w:p>
+      <w:r>
+        <w:br w:type="page"/>
+      </w:r>
+    </w:p>
+    <w:p>
+      <w:pPr>
+        <w:pStyle w:val="Heading1"/>
+      </w:pPr>
+      <w:r>
+        <w:t>4. Preliminary Environmental &amp; SDG Impact Framework</w:t>
+      </w:r>
+    </w:p>
+    <w:p>
+      <w:r>
+        <w:rPr>
+          <w:b/>
+        </w:rPr>
+        <w:t xml:space="preserve">Metric Category: </w:t>
+      </w:r>
+      <w:r>
+        <w:t>Career skills navigation and reskilling readiness (social/economic impact). FutureReady has no measured direct environmental benefit; no emissions or resource savings are claimed.</w:t>
+      </w:r>
+    </w:p>
+    <w:p>
+      <w:r>
+        <w:rPr>
+          <w:b/>
+        </w:rPr>
+        <w:t xml:space="preserve">Target SDG Sub-Target(s): </w:t>
+      </w:r>
+      <w:r>
+        <w:t>Primary: SDG 4, Target 4.4 — “By 2030, substantially increase the number of youth and adults who have relevant skills, including technical and vocational skills, for employment, decent jobs and entrepreneurship.” Supporting: SDG 8, Target 8.5 — “By 2030, achieve full and productive employment and decent work for all women and men, including for young people and persons with disabilities, and equal pay for work of equal value.” The prototype supports career exploration and skills planning; it does not claim to deliver employment outcomes.</w:t>
+      </w:r>
+    </w:p>
+    <w:p>
+      <w:r>
+        <w:rPr>
+          <w:b/>
+        </w:rPr>
+        <w:t xml:space="preserve">Current Problem Baseline: </w:t>
+      </w:r>
+      <w:r>
+        <w:t>The World Economic Forum’s 2025 survey of employers found that 63% identified skills gaps as a major barrier to business transformation; employers also expect 39% of workers’ core skills to change by 2030. These are global employer expectations, not Malaysia-specific worker outcomes. FutureReady has not yet collected a participant baseline; the Phase 2 pilot will record the same task measure before product use.</w:t>
+      </w:r>
+    </w:p>
+    <w:p>
+      <w:r>
+        <w:rPr>
+          <w:b/>
+        </w:rPr>
+        <w:t xml:space="preserve">Core Measurable KPI: </w:t>
+      </w:r>
+      <w:r>
+        <w:t>Percentage-point change in pilot participants who can complete a short, scored task: explain one recommended role, identify one skill gap, and select one linked learning option. Use the same assessment before and after using FutureReady; report numerator, denominator, and completion time.</w:t>
+      </w:r>
+    </w:p>
+    <w:p>
+      <w:r>
+        <w:rPr>
+          <w:b/>
+        </w:rPr>
+        <w:t xml:space="preserve">Phase 2 Impact Target: </w:t>
+      </w:r>
+      <w:r>
+        <w:t>In a small pilot of at least 10 consenting adult participants, achieve at least a 20-percentage-point improvement over the pre-use task pass rate and at least an 80% post-use pass rate. Treat this as an early usability and career-navigation signal, not proof of improved employment or SDG outcomes. Disaggregate results only where consent and sample size protect privacy.</w:t>
+      </w:r>
+    </w:p>
+    <w:p>
+      <w:r>
+        <w:rPr>
+          <w:b/>
+        </w:rPr>
+        <w:t xml:space="preserve">Sources: </w:t>
+      </w:r>
+      <w:r>
+        <w:t>World Economic Forum, The Future of Jobs Report 2025, skills outlook and workforce strategies, published 7 January 2025: https://www.weforum.org/publications/the-future-of-jobs-report-2025/3-skills-outlook/ and https://www.weforum.org/publications/the-future-of-jobs-report-2025/in-full/4-workforce-strategies/ . United Nations, SDG Goal 4, Target 4.4: https://sdgs.un.org/goals/goal4 . United Nations, SDG Goal 8, Target 8.5: https://sdgs.un.org/goals/goal8 .</w:t>
+      </w:r>
+    </w:p>
+    <w:p>
+      <w:pPr>
+        <w:pStyle w:val="Heading1"/>
+      </w:pPr>
+      <w:r>
+        <w:t>5. Eligibility &amp; Readiness Checklist</w:t>
+      </w:r>
+    </w:p>
+    <w:p>
+      <w:pPr>
+        <w:pStyle w:val="ListBullet"/>
+      </w:pPr>
+      <w:r>
+        <w:t>☐ All team members have completed the mandatory GenAI, Database, and Cloud Deployment upskilling workshops. Team leader: confirm attendance before ticking.</w:t>
+      </w:r>
+    </w:p>
+    <w:p>
+      <w:pPr>
+        <w:pStyle w:val="ListBullet"/>
+      </w:pPr>
+      <w:r>
+        <w:t>☒ The project concept addresses a documented real-world problem and maps directly to SDG Targets 4.4 and 8.5 (see Section 4 and cited sources).</w:t>
+      </w:r>
+    </w:p>
+    <w:p>
+      <w:pPr>
+        <w:pStyle w:val="ListBullet"/>
+      </w:pPr>
+      <w:r>
+        <w:t>☒ The proposed solution is a functional, deployed application. The public Render demo is configured for synthetic profiles; full resume-model analysis requires a properly provisioned local setup.</w:t>
+      </w:r>
+    </w:p>
+    <w:p>
+      <w:pPr>
+        <w:pStyle w:val="ListBullet"/>
+      </w:pPr>
+      <w:r>
+        <w:t>☐ All fields in this template have been completed within the stated word limits. Leave unchecked until team-specific declarations, sign-off, and remaining submission materials are completed.</w:t>
+      </w:r>
+    </w:p>
+    <w:p>
+      <w:pPr>
+        <w:pStyle w:val="Heading1"/>
+      </w:pPr>
+      <w:r>
+        <w:t>6. IP &amp; Originality Declaration</w:t>
+      </w:r>
+    </w:p>
+    <w:p>
+      <w:pPr>
+        <w:pStyle w:val="Heading2"/>
+      </w:pPr>
+      <w:r>
+        <w:t>6.1 Pre-Existing / Prior-Owned Work</w:t>
+      </w:r>
+    </w:p>
+    <w:p>
+      <w:r>
+        <w:rPr>
+          <w:b/>
+        </w:rPr>
+        <w:t xml:space="preserve">Selection: </w:t>
+      </w:r>
+      <w:r>
+        <w:t>[TEAM LEADER MUST CONFIRM — tick Yes or No only after checking the official hackathon start date and project history.]</w:t>
+      </w:r>
+    </w:p>
+    <w:p>
+      <w:r>
+        <w:t>The FutureReady source repository, interface, data package, and prototype were already present when this submission form was prepared. The team must compare the creation dates of each item with the official hackathon start date and list the actual team member(s) who created or owned any pre-existing work. If applicable, disclose the relevant code, design, research, prototype, and documentation rather than describing the whole project as newly created.</w:t>
+      </w:r>
+    </w:p>
+    <w:p>
+      <w:pPr>
+        <w:pStyle w:val="Heading2"/>
+      </w:pPr>
+      <w:r>
+        <w:t>6.2 Third-Party Code, Datasets, or Models</w:t>
+      </w:r>
+    </w:p>
+    <w:p>
+      <w:r>
+        <w:rPr>
+          <w:b/>
+        </w:rPr>
+        <w:t xml:space="preserve">Selection: </w:t>
+      </w:r>
+      <w:r>
+        <w:t>YES</w:t>
+      </w:r>
+    </w:p>
+    <w:tbl>
+      <w:tblPr>
+        <w:tblStyle w:val="LightShading-Accent1"/>
+        <w:tblW w:type="auto" w:w="0"/>
+        <w:tblLook w:firstColumn="1" w:firstRow="1" w:lastColumn="0" w:lastRow="0" w:noHBand="0" w:noVBand="1" w:val="04A0"/>
+      </w:tblPr>
+      <w:tblGrid>
+        <w:gridCol w:w="3120"/>
+        <w:gridCol w:w="3120"/>
+        <w:gridCol w:w="3120"/>
+      </w:tblGrid>
+      <w:tr>
+        <w:tc>
+          <w:tcPr>
+            <w:tcW w:type="dxa" w:w="3120"/>
+          </w:tcPr>
+          <w:p>
+            <w:r>
+              <w:t>Name</w:t>
+            </w:r>
+          </w:p>
+        </w:tc>
+        <w:tc>
+          <w:tcPr>
+            <w:tcW w:type="dxa" w:w="3120"/>
+          </w:tcPr>
+          <w:p>
+            <w:r>
+              <w:t>Type</w:t>
+            </w:r>
+          </w:p>
+        </w:tc>
+        <w:tc>
+          <w:tcPr>
+            <w:tcW w:type="dxa" w:w="3120"/>
+          </w:tcPr>
+          <w:p>
+            <w:r>
+              <w:t>License / terms</w:t>
+            </w:r>
+          </w:p>
+        </w:tc>
+      </w:tr>
+      <w:tr>
+        <w:tc>
+          <w:tcPr>
+            <w:tcW w:type="dxa" w:w="3120"/>
+          </w:tcPr>
+          <w:p>
+            <w:r>
+              <w:t>React, TypeScript, Vite, FastAPI, Uvicorn, NumPy, ONNX Runtime, Tokenizers, and other locked dependencies</w:t>
+            </w:r>
+          </w:p>
+        </w:tc>
+        <w:tc>
+          <w:tcPr>
+            <w:tcW w:type="dxa" w:w="3120"/>
+          </w:tcPr>
+          <w:p>
+            <w:r>
+              <w:t>Open-source code libraries and frameworks</w:t>
+            </w:r>
+          </w:p>
+        </w:tc>
+        <w:tc>
+          <w:tcPr>
+            <w:tcW w:type="dxa" w:w="3120"/>
+          </w:tcPr>
+          <w:p>
+            <w:r>
+              <w:t>Mixed; each package retains its own upstream license. See package.json, pnpm-lock.yaml, pyproject.toml, uv.lock, and requirements.lock.</w:t>
+            </w:r>
+          </w:p>
+        </w:tc>
+      </w:tr>
+      <w:tr>
+        <w:tc>
+          <w:tcPr>
+            <w:tcW w:type="dxa" w:w="3120"/>
+          </w:tcPr>
+          <w:p>
+            <w:r>
+              <w:t>intfloat/multilingual-e5-small and pinned Xenova/multilingual-e5-small quantized ONNX assets</w:t>
+            </w:r>
+          </w:p>
+        </w:tc>
+        <w:tc>
+          <w:tcPr>
+            <w:tcW w:type="dxa" w:w="3120"/>
+          </w:tcPr>
+          <w:p>
+            <w:r>
+              <w:t>Pre-trained embedding model</w:t>
+            </w:r>
+          </w:p>
+        </w:tc>
+        <w:tc>
+          <w:tcPr>
+            <w:tcW w:type="dxa" w:w="3120"/>
+          </w:tcPr>
+          <w:p>
+            <w:r>
+              <w:t>MIT; model revision and asset hashes are recorded in docs/model-notice.md.</w:t>
+            </w:r>
+          </w:p>
+        </w:tc>
+      </w:tr>
+      <w:tr>
+        <w:tc>
+          <w:tcPr>
+            <w:tcW w:type="dxa" w:w="3120"/>
+          </w:tcPr>
+          <w:p>
+            <w:r>
+              <w:t>Department of Statistics Malaysia / data.gov.my labour-force skills-related underemployment data</w:t>
+            </w:r>
+          </w:p>
+        </w:tc>
+        <w:tc>
+          <w:tcPr>
+            <w:tcW w:type="dxa" w:w="3120"/>
+          </w:tcPr>
+          <w:p>
+            <w:r>
+              <w:t>Public dataset</w:t>
+            </w:r>
+          </w:p>
+        </w:tc>
+        <w:tc>
+          <w:tcPr>
+            <w:tcW w:type="dxa" w:w="3120"/>
+          </w:tcPr>
+          <w:p>
+            <w:r>
+              <w:t>CC BY 4.0 as recorded in the project attribution file; retain attribution.</w:t>
+            </w:r>
+          </w:p>
+        </w:tc>
+      </w:tr>
+      <w:tr>
+        <w:tc>
+          <w:tcPr>
+            <w:tcW w:type="dxa" w:w="3120"/>
+          </w:tcPr>
+          <w:p>
+            <w:r>
+              <w:t>O*NET, U.S. Bureau of Labor Statistics, TalentCorp MYCOL, Arbeitnow job postings, and arXiv metadata</w:t>
+            </w:r>
+          </w:p>
+        </w:tc>
+        <w:tc>
+          <w:tcPr>
+            <w:tcW w:type="dxa" w:w="3120"/>
+          </w:tcPr>
+          <w:p>
+            <w:r>
+              <w:t>Public occupational, forecast, job-posting, or research-source facts/metadata</w:t>
+            </w:r>
+          </w:p>
+        </w:tc>
+        <w:tc>
+          <w:tcPr>
+            <w:tcW w:type="dxa" w:w="3120"/>
+          </w:tcPr>
+          <w:p>
+            <w:r>
+              <w:t>Source-specific terms apply. Attribution and reuse notes are in artifacts/api-server/data-package/ATTRIBUTION_AND_USE.md; public access does not imply unrestricted redistribution.</w:t>
+            </w:r>
+          </w:p>
+        </w:tc>
+      </w:tr>
+      <w:tr>
+        <w:tc>
+          <w:tcPr>
+            <w:tcW w:type="dxa" w:w="3120"/>
+          </w:tcPr>
+          <w:p>
+            <w:r>
+              <w:t>Course/provider catalogue metadata and United Nations SDG references</w:t>
+            </w:r>
+          </w:p>
+        </w:tc>
+        <w:tc>
+          <w:tcPr>
+            <w:tcW w:type="dxa" w:w="3120"/>
+          </w:tcPr>
+          <w:p>
+            <w:r>
+              <w:t>Third-party metadata and public reference text</w:t>
+            </w:r>
+          </w:p>
+        </w:tc>
+        <w:tc>
+          <w:tcPr>
+            <w:tcW w:type="dxa" w:w="3120"/>
+          </w:tcPr>
+          <w:p>
+            <w:r>
+              <w:t>Provider/source terms apply. The project stores selected metadata and links, not course content.</w:t>
+            </w:r>
+          </w:p>
+        </w:tc>
+      </w:tr>
+      <w:tr>
+        <w:tc>
+          <w:tcPr>
+            <w:tcW w:type="dxa" w:w="3120"/>
+          </w:tcPr>
+          <w:p>
+            <w:r>
+              <w:t>Project-supplied 65-role catalogue</w:t>
+            </w:r>
+          </w:p>
+        </w:tc>
+        <w:tc>
+          <w:tcPr>
+            <w:tcW w:type="dxa" w:w="3120"/>
+          </w:tcPr>
+          <w:p>
+            <w:r>
+              <w:t>Role and skill dataset</w:t>
+            </w:r>
+          </w:p>
+        </w:tc>
+        <w:tc>
+          <w:tcPr>
+            <w:tcW w:type="dxa" w:w="3120"/>
+          </w:tcPr>
+          <w:p>
+            <w:r>
+              <w:t>Upstream redistribution terms were not supplied with the repository; the team must confirm the catalogue owner’s license/permission before external redistribution.</w:t>
+            </w:r>
+          </w:p>
+        </w:tc>
+      </w:tr>
+    </w:tbl>
+    <w:p>
+      <w:r>
+        <w:t>The project root Apache License 2.0 covers original FutureReady code and documentation only where no separate notice applies. It does not override third-party terms. See NOTICE, docs/model-notice.md, and the data-package attribution file.</w:t>
+      </w:r>
+    </w:p>
+    <w:p>
+      <w:pPr>
+        <w:pStyle w:val="Heading2"/>
+      </w:pPr>
+      <w:r>
+        <w:t>6.3 Employment-Related IP Conflicts</w:t>
+      </w:r>
+    </w:p>
+    <w:p>
+      <w:r>
+        <w:rPr>
+          <w:b/>
+        </w:rPr>
+        <w:t xml:space="preserve">Selection: </w:t>
+      </w:r>
+      <w:r>
+        <w:t>[EACH TEAM MEMBER MUST CONFIRM — tick Yes or No after checking applicable employment, internship, and consulting agreements.]</w:t>
+      </w:r>
+    </w:p>
+    <w:p>
+      <w:r>
+        <w:t>If Yes, identify the affected member(s) and describe the relevant agreement or potential ownership claim. Do not include confidential contract text. If none of the team members is subject to such a claim, tick No.</w:t>
+      </w:r>
+    </w:p>
+    <w:p>
+      <w:pPr>
+        <w:pStyle w:val="Heading1"/>
+      </w:pPr>
+      <w:r>
+        <w:t>7. Declaration</w:t>
+      </w:r>
+    </w:p>
+    <w:p>
+      <w:r>
+        <w:t>By submitting this proposal, the team leader confirms that the information provided is accurate to the best of the team’s knowledge and that the project is original work created during the SDC 2026 hackathon period. The team leader must verify the originality statement against the project history and the official hackathon dates before signing.</w:t>
+      </w:r>
+    </w:p>
+    <w:p>
+      <w:r>
+        <w:rPr>
+          <w:b/>
+        </w:rPr>
+        <w:t xml:space="preserve">Signature: </w:t>
+      </w:r>
+      <w:r>
+        <w:rPr>
+          <w:b/>
+        </w:rPr>
+        <w:t>____________________________________</w:t>
+      </w:r>
+    </w:p>
+    <w:p>
+      <w:r>
+        <w:rPr>
+          <w:b/>
+        </w:rPr>
+        <w:t xml:space="preserve">Name: </w:t>
+      </w:r>
+      <w:r>
+        <w:rPr>
+          <w:b/>
+        </w:rPr>
+        <w:t>________________________________________</w:t>
+      </w:r>
+    </w:p>
+    <w:p>
+      <w:r>
+        <w:rPr>
+          <w:b/>
+        </w:rPr>
+        <w:t xml:space="preserve">Date: </w:t>
+      </w:r>
+      <w:r>
+        <w:rPr>
+          <w:b/>
+        </w:rPr>
+        <w:t>_________________________________________</w:t>
+      </w:r>
+    </w:p>
+    <w:sectPr>
+      <w:pgSz w:w="12240" w:h="15840"/>
+      <w:pgMar w:top="1440" w:right="1440" w:bottom="1440" w:left="1440" w:header="720" w:footer="720" w:gutter="0"/>
+    </w:sectPr>
   </w:body>
 </w:document>
 </file>

</xml_diff>